<commit_message>
refactor: use namespace std, remove English comments, and update defense materials
</commit_message>
<xml_diff>
--- a/work1/reports/report.docx
+++ b/work1/reports/report.docx
@@ -343,7 +343,7 @@
           <w:b w:val="0"/>
           <w:sz w:val="16"/>
         </w:rPr>
-        <w:t>#include &lt;cuda_runtime.h&gt;</w:t>
+        <w:t>#include &lt;cstddef&gt;</w:t>
         <w:br/>
       </w:r>
       <w:r>
@@ -370,7 +370,7 @@
           <w:b w:val="0"/>
           <w:sz w:val="16"/>
         </w:rPr>
-        <w:t>#include &lt;cstddef&gt;</w:t>
+        <w:t>#include &lt;cuda_runtime.h&gt;</w:t>
         <w:br/>
       </w:r>
       <w:r>
@@ -387,7 +387,7 @@
           <w:b w:val="0"/>
           <w:sz w:val="16"/>
         </w:rPr>
-        <w:t>template &lt;typename AtomT&gt;</w:t>
+        <w:t>using namespace std;</w:t>
         <w:br/>
       </w:r>
       <w:r>
@@ -396,7 +396,6 @@
           <w:b w:val="0"/>
           <w:sz w:val="16"/>
         </w:rPr>
-        <w:t>class Data {</w:t>
         <w:br/>
       </w:r>
       <w:r>
@@ -405,7 +404,7 @@
           <w:b w:val="0"/>
           <w:sz w:val="16"/>
         </w:rPr>
-        <w:t>private:</w:t>
+        <w:t>template &lt;typename AtomT&gt;</w:t>
         <w:br/>
       </w:r>
       <w:r>
@@ -414,7 +413,7 @@
           <w:b w:val="0"/>
           <w:sz w:val="16"/>
         </w:rPr>
-        <w:t xml:space="preserve">    std::size_t size_;</w:t>
+        <w:t>class Data {</w:t>
         <w:br/>
       </w:r>
       <w:r>
@@ -423,7 +422,7 @@
           <w:b w:val="0"/>
           <w:sz w:val="16"/>
         </w:rPr>
-        <w:t xml:space="preserve">    AtomT* data_;</w:t>
+        <w:t>private:</w:t>
         <w:br/>
       </w:r>
       <w:r>
@@ -432,6 +431,7 @@
           <w:b w:val="0"/>
           <w:sz w:val="16"/>
         </w:rPr>
+        <w:t xml:space="preserve">    size_t size_;</w:t>
         <w:br/>
       </w:r>
       <w:r>
@@ -440,7 +440,7 @@
           <w:b w:val="0"/>
           <w:sz w:val="16"/>
         </w:rPr>
-        <w:t xml:space="preserve">    void allocate(std::size_t size) {</w:t>
+        <w:t xml:space="preserve">    AtomT* data_;</w:t>
         <w:br/>
       </w:r>
       <w:r>
@@ -449,7 +449,6 @@
           <w:b w:val="0"/>
           <w:sz w:val="16"/>
         </w:rPr>
-        <w:t xml:space="preserve">        if (size &gt; 0) {</w:t>
         <w:br/>
       </w:r>
       <w:r>
@@ -458,7 +457,7 @@
           <w:b w:val="0"/>
           <w:sz w:val="16"/>
         </w:rPr>
-        <w:t xml:space="preserve">            cudaError_t err = cudaMalloc(&amp;data_, size * sizeof(AtomT));</w:t>
+        <w:t xml:space="preserve">    void allocate(size_t size) {</w:t>
         <w:br/>
       </w:r>
       <w:r>
@@ -467,7 +466,7 @@
           <w:b w:val="0"/>
           <w:sz w:val="16"/>
         </w:rPr>
-        <w:t xml:space="preserve">            if (err != cudaSuccess) {</w:t>
+        <w:t xml:space="preserve">        if (size &gt; 0) {</w:t>
         <w:br/>
       </w:r>
       <w:r>
@@ -476,7 +475,7 @@
           <w:b w:val="0"/>
           <w:sz w:val="16"/>
         </w:rPr>
-        <w:t xml:space="preserve">                throw std::runtime_error(cudaGetErrorString(err));</w:t>
+        <w:t xml:space="preserve">            cudaError_t err = cudaMalloc(&amp;data_, size * sizeof(AtomT));</w:t>
         <w:br/>
       </w:r>
       <w:r>
@@ -485,7 +484,7 @@
           <w:b w:val="0"/>
           <w:sz w:val="16"/>
         </w:rPr>
-        <w:t xml:space="preserve">            }</w:t>
+        <w:t xml:space="preserve">            if (err != cudaSuccess) {</w:t>
         <w:br/>
       </w:r>
       <w:r>
@@ -494,7 +493,7 @@
           <w:b w:val="0"/>
           <w:sz w:val="16"/>
         </w:rPr>
-        <w:t xml:space="preserve">        } else {</w:t>
+        <w:t xml:space="preserve">                throw runtime_error(cudaGetErrorString(err));</w:t>
         <w:br/>
       </w:r>
       <w:r>
@@ -503,7 +502,7 @@
           <w:b w:val="0"/>
           <w:sz w:val="16"/>
         </w:rPr>
-        <w:t xml:space="preserve">            data_ = nullptr;</w:t>
+        <w:t xml:space="preserve">            }</w:t>
         <w:br/>
       </w:r>
       <w:r>
@@ -512,7 +511,7 @@
           <w:b w:val="0"/>
           <w:sz w:val="16"/>
         </w:rPr>
-        <w:t xml:space="preserve">        }</w:t>
+        <w:t xml:space="preserve">        } else {</w:t>
         <w:br/>
       </w:r>
       <w:r>
@@ -521,7 +520,7 @@
           <w:b w:val="0"/>
           <w:sz w:val="16"/>
         </w:rPr>
-        <w:t xml:space="preserve">    }</w:t>
+        <w:t xml:space="preserve">            data_ = nullptr;</w:t>
         <w:br/>
       </w:r>
       <w:r>
@@ -530,6 +529,7 @@
           <w:b w:val="0"/>
           <w:sz w:val="16"/>
         </w:rPr>
+        <w:t xml:space="preserve">        }</w:t>
         <w:br/>
       </w:r>
       <w:r>
@@ -538,7 +538,7 @@
           <w:b w:val="0"/>
           <w:sz w:val="16"/>
         </w:rPr>
-        <w:t xml:space="preserve">    void free_memory() {</w:t>
+        <w:t xml:space="preserve">    }</w:t>
         <w:br/>
       </w:r>
       <w:r>
@@ -547,7 +547,6 @@
           <w:b w:val="0"/>
           <w:sz w:val="16"/>
         </w:rPr>
-        <w:t xml:space="preserve">        if (data_) {</w:t>
         <w:br/>
       </w:r>
       <w:r>
@@ -556,7 +555,7 @@
           <w:b w:val="0"/>
           <w:sz w:val="16"/>
         </w:rPr>
-        <w:t xml:space="preserve">            cudaFree(data_);</w:t>
+        <w:t xml:space="preserve">    void free_memory() {</w:t>
         <w:br/>
       </w:r>
       <w:r>
@@ -565,7 +564,7 @@
           <w:b w:val="0"/>
           <w:sz w:val="16"/>
         </w:rPr>
-        <w:t xml:space="preserve">            data_ = nullptr;</w:t>
+        <w:t xml:space="preserve">        if (data_) {</w:t>
         <w:br/>
       </w:r>
       <w:r>
@@ -574,7 +573,7 @@
           <w:b w:val="0"/>
           <w:sz w:val="16"/>
         </w:rPr>
-        <w:t xml:space="preserve">        }</w:t>
+        <w:t xml:space="preserve">            cudaFree(data_);</w:t>
         <w:br/>
       </w:r>
       <w:r>
@@ -583,7 +582,7 @@
           <w:b w:val="0"/>
           <w:sz w:val="16"/>
         </w:rPr>
-        <w:t xml:space="preserve">    }</w:t>
+        <w:t xml:space="preserve">            data_ = nullptr;</w:t>
         <w:br/>
       </w:r>
       <w:r>
@@ -592,6 +591,7 @@
           <w:b w:val="0"/>
           <w:sz w:val="16"/>
         </w:rPr>
+        <w:t xml:space="preserve">        }</w:t>
         <w:br/>
       </w:r>
       <w:r>
@@ -600,7 +600,7 @@
           <w:b w:val="0"/>
           <w:sz w:val="16"/>
         </w:rPr>
-        <w:t>public:</w:t>
+        <w:t xml:space="preserve">    }</w:t>
         <w:br/>
       </w:r>
       <w:r>
@@ -609,7 +609,6 @@
           <w:b w:val="0"/>
           <w:sz w:val="16"/>
         </w:rPr>
-        <w:t xml:space="preserve">    explicit Data(std::size_t size) : size_(size), data_(nullptr) {</w:t>
         <w:br/>
       </w:r>
       <w:r>
@@ -618,7 +617,7 @@
           <w:b w:val="0"/>
           <w:sz w:val="16"/>
         </w:rPr>
-        <w:t xml:space="preserve">        allocate(size_);</w:t>
+        <w:t>public:</w:t>
         <w:br/>
       </w:r>
       <w:r>
@@ -627,7 +626,7 @@
           <w:b w:val="0"/>
           <w:sz w:val="16"/>
         </w:rPr>
-        <w:t xml:space="preserve">    }</w:t>
+        <w:t xml:space="preserve">    explicit Data(size_t size) : size_(size), data_(nullptr) {</w:t>
         <w:br/>
       </w:r>
       <w:r>
@@ -636,6 +635,7 @@
           <w:b w:val="0"/>
           <w:sz w:val="16"/>
         </w:rPr>
+        <w:t xml:space="preserve">        allocate(size_);</w:t>
         <w:br/>
       </w:r>
       <w:r>
@@ -644,7 +644,7 @@
           <w:b w:val="0"/>
           <w:sz w:val="16"/>
         </w:rPr>
-        <w:t xml:space="preserve">    Data(const Data&amp; other) : size_(other.size_), data_(nullptr) {</w:t>
+        <w:t xml:space="preserve">    }</w:t>
         <w:br/>
       </w:r>
       <w:r>
@@ -653,7 +653,6 @@
           <w:b w:val="0"/>
           <w:sz w:val="16"/>
         </w:rPr>
-        <w:t xml:space="preserve">        allocate(size_);</w:t>
         <w:br/>
       </w:r>
       <w:r>
@@ -662,7 +661,7 @@
           <w:b w:val="0"/>
           <w:sz w:val="16"/>
         </w:rPr>
-        <w:t xml:space="preserve">        if (size_ &gt; 0) {</w:t>
+        <w:t xml:space="preserve">    Data(const Data&amp; other) : size_(other.size_), data_(nullptr) {</w:t>
         <w:br/>
       </w:r>
       <w:r>
@@ -671,7 +670,7 @@
           <w:b w:val="0"/>
           <w:sz w:val="16"/>
         </w:rPr>
-        <w:t xml:space="preserve">            cudaError_t err = cudaMemcpy(data_, other.data_, size_ * sizeof(AtomT), cudaMemcpyDeviceToDevice);</w:t>
+        <w:t xml:space="preserve">        allocate(size_);</w:t>
         <w:br/>
       </w:r>
       <w:r>
@@ -680,7 +679,7 @@
           <w:b w:val="0"/>
           <w:sz w:val="16"/>
         </w:rPr>
-        <w:t xml:space="preserve">            if (err != cudaSuccess) {</w:t>
+        <w:t xml:space="preserve">        if (size_ &gt; 0) {</w:t>
         <w:br/>
       </w:r>
       <w:r>
@@ -689,7 +688,7 @@
           <w:b w:val="0"/>
           <w:sz w:val="16"/>
         </w:rPr>
-        <w:t xml:space="preserve">                free_memory();</w:t>
+        <w:t xml:space="preserve">            cudaError_t err = cudaMemcpy(data_, other.data_, size_ * sizeof(AtomT), cudaMemcpyDeviceToDevice);</w:t>
         <w:br/>
       </w:r>
       <w:r>
@@ -698,7 +697,7 @@
           <w:b w:val="0"/>
           <w:sz w:val="16"/>
         </w:rPr>
-        <w:t xml:space="preserve">                throw std::runtime_error(cudaGetErrorString(err));</w:t>
+        <w:t xml:space="preserve">            if (err != cudaSuccess) {</w:t>
         <w:br/>
       </w:r>
       <w:r>
@@ -707,7 +706,7 @@
           <w:b w:val="0"/>
           <w:sz w:val="16"/>
         </w:rPr>
-        <w:t xml:space="preserve">            }</w:t>
+        <w:t xml:space="preserve">                free_memory();</w:t>
         <w:br/>
       </w:r>
       <w:r>
@@ -716,7 +715,7 @@
           <w:b w:val="0"/>
           <w:sz w:val="16"/>
         </w:rPr>
-        <w:t xml:space="preserve">        }</w:t>
+        <w:t xml:space="preserve">                throw runtime_error(cudaGetErrorString(err));</w:t>
         <w:br/>
       </w:r>
       <w:r>
@@ -725,7 +724,7 @@
           <w:b w:val="0"/>
           <w:sz w:val="16"/>
         </w:rPr>
-        <w:t xml:space="preserve">    }</w:t>
+        <w:t xml:space="preserve">            }</w:t>
         <w:br/>
       </w:r>
       <w:r>
@@ -734,6 +733,7 @@
           <w:b w:val="0"/>
           <w:sz w:val="16"/>
         </w:rPr>
+        <w:t xml:space="preserve">        }</w:t>
         <w:br/>
       </w:r>
       <w:r>
@@ -742,7 +742,7 @@
           <w:b w:val="0"/>
           <w:sz w:val="16"/>
         </w:rPr>
-        <w:t xml:space="preserve">    Data(Data&amp;&amp; other) noexcept : size_(other.size_), data_(other.data_) {</w:t>
+        <w:t xml:space="preserve">    }</w:t>
         <w:br/>
       </w:r>
       <w:r>
@@ -751,7 +751,6 @@
           <w:b w:val="0"/>
           <w:sz w:val="16"/>
         </w:rPr>
-        <w:t xml:space="preserve">        other.size_ = 0;</w:t>
         <w:br/>
       </w:r>
       <w:r>
@@ -760,7 +759,7 @@
           <w:b w:val="0"/>
           <w:sz w:val="16"/>
         </w:rPr>
-        <w:t xml:space="preserve">        other.data_ = nullptr;</w:t>
+        <w:t xml:space="preserve">    Data(Data&amp;&amp; other) noexcept : size_(other.size_), data_(other.data_) {</w:t>
         <w:br/>
       </w:r>
       <w:r>
@@ -769,7 +768,7 @@
           <w:b w:val="0"/>
           <w:sz w:val="16"/>
         </w:rPr>
-        <w:t xml:space="preserve">    }</w:t>
+        <w:t xml:space="preserve">        other.size_ = 0;</w:t>
         <w:br/>
       </w:r>
       <w:r>
@@ -778,6 +777,7 @@
           <w:b w:val="0"/>
           <w:sz w:val="16"/>
         </w:rPr>
+        <w:t xml:space="preserve">        other.data_ = nullptr;</w:t>
         <w:br/>
       </w:r>
       <w:r>
@@ -786,7 +786,7 @@
           <w:b w:val="0"/>
           <w:sz w:val="16"/>
         </w:rPr>
-        <w:t xml:space="preserve">    Data&amp; operator=(const Data&amp; other) {</w:t>
+        <w:t xml:space="preserve">    }</w:t>
         <w:br/>
       </w:r>
       <w:r>
@@ -795,7 +795,6 @@
           <w:b w:val="0"/>
           <w:sz w:val="16"/>
         </w:rPr>
-        <w:t xml:space="preserve">        if (this != &amp;other) {</w:t>
         <w:br/>
       </w:r>
       <w:r>
@@ -804,7 +803,7 @@
           <w:b w:val="0"/>
           <w:sz w:val="16"/>
         </w:rPr>
-        <w:t xml:space="preserve">            Data temp(other);</w:t>
+        <w:t xml:space="preserve">    Data&amp; operator=(const Data&amp; other) {</w:t>
         <w:br/>
       </w:r>
       <w:r>
@@ -813,7 +812,7 @@
           <w:b w:val="0"/>
           <w:sz w:val="16"/>
         </w:rPr>
-        <w:t xml:space="preserve">            std::swap(size_, temp.size_);</w:t>
+        <w:t xml:space="preserve">        if (this != &amp;other) {</w:t>
         <w:br/>
       </w:r>
       <w:r>
@@ -822,7 +821,7 @@
           <w:b w:val="0"/>
           <w:sz w:val="16"/>
         </w:rPr>
-        <w:t xml:space="preserve">            std::swap(data_, temp.data_);</w:t>
+        <w:t xml:space="preserve">            Data temp(other);</w:t>
         <w:br/>
       </w:r>
       <w:r>
@@ -831,7 +830,7 @@
           <w:b w:val="0"/>
           <w:sz w:val="16"/>
         </w:rPr>
-        <w:t xml:space="preserve">        }</w:t>
+        <w:t xml:space="preserve">            swap(size_, temp.size_);</w:t>
         <w:br/>
       </w:r>
       <w:r>
@@ -840,7 +839,7 @@
           <w:b w:val="0"/>
           <w:sz w:val="16"/>
         </w:rPr>
-        <w:t xml:space="preserve">        return *this;</w:t>
+        <w:t xml:space="preserve">            swap(data_, temp.data_);</w:t>
         <w:br/>
       </w:r>
       <w:r>
@@ -849,7 +848,7 @@
           <w:b w:val="0"/>
           <w:sz w:val="16"/>
         </w:rPr>
-        <w:t xml:space="preserve">    }</w:t>
+        <w:t xml:space="preserve">        }</w:t>
         <w:br/>
       </w:r>
       <w:r>
@@ -858,6 +857,7 @@
           <w:b w:val="0"/>
           <w:sz w:val="16"/>
         </w:rPr>
+        <w:t xml:space="preserve">        return *this;</w:t>
         <w:br/>
       </w:r>
       <w:r>
@@ -866,7 +866,7 @@
           <w:b w:val="0"/>
           <w:sz w:val="16"/>
         </w:rPr>
-        <w:t xml:space="preserve">    Data&amp; operator=(Data&amp;&amp; other) noexcept {</w:t>
+        <w:t xml:space="preserve">    }</w:t>
         <w:br/>
       </w:r>
       <w:r>
@@ -875,7 +875,6 @@
           <w:b w:val="0"/>
           <w:sz w:val="16"/>
         </w:rPr>
-        <w:t xml:space="preserve">        if (this != &amp;other) {</w:t>
         <w:br/>
       </w:r>
       <w:r>
@@ -884,7 +883,7 @@
           <w:b w:val="0"/>
           <w:sz w:val="16"/>
         </w:rPr>
-        <w:t xml:space="preserve">            free_memory();</w:t>
+        <w:t xml:space="preserve">    Data&amp; operator=(Data&amp;&amp; other) noexcept {</w:t>
         <w:br/>
       </w:r>
       <w:r>
@@ -893,7 +892,7 @@
           <w:b w:val="0"/>
           <w:sz w:val="16"/>
         </w:rPr>
-        <w:t xml:space="preserve">            size_ = other.size_;</w:t>
+        <w:t xml:space="preserve">        if (this != &amp;other) {</w:t>
         <w:br/>
       </w:r>
       <w:r>
@@ -902,7 +901,7 @@
           <w:b w:val="0"/>
           <w:sz w:val="16"/>
         </w:rPr>
-        <w:t xml:space="preserve">            data_ = other.data_;</w:t>
+        <w:t xml:space="preserve">            free_memory();</w:t>
         <w:br/>
       </w:r>
       <w:r>
@@ -911,7 +910,7 @@
           <w:b w:val="0"/>
           <w:sz w:val="16"/>
         </w:rPr>
-        <w:t xml:space="preserve">            other.size_ = 0;</w:t>
+        <w:t xml:space="preserve">            size_ = other.size_;</w:t>
         <w:br/>
       </w:r>
       <w:r>
@@ -920,7 +919,7 @@
           <w:b w:val="0"/>
           <w:sz w:val="16"/>
         </w:rPr>
-        <w:t xml:space="preserve">            other.data_ = nullptr;</w:t>
+        <w:t xml:space="preserve">            data_ = other.data_;</w:t>
         <w:br/>
       </w:r>
       <w:r>
@@ -929,7 +928,7 @@
           <w:b w:val="0"/>
           <w:sz w:val="16"/>
         </w:rPr>
-        <w:t xml:space="preserve">        }</w:t>
+        <w:t xml:space="preserve">            other.size_ = 0;</w:t>
         <w:br/>
       </w:r>
       <w:r>
@@ -938,7 +937,7 @@
           <w:b w:val="0"/>
           <w:sz w:val="16"/>
         </w:rPr>
-        <w:t xml:space="preserve">        return *this;</w:t>
+        <w:t xml:space="preserve">            other.data_ = nullptr;</w:t>
         <w:br/>
       </w:r>
       <w:r>
@@ -947,7 +946,7 @@
           <w:b w:val="0"/>
           <w:sz w:val="16"/>
         </w:rPr>
-        <w:t xml:space="preserve">    }</w:t>
+        <w:t xml:space="preserve">        }</w:t>
         <w:br/>
       </w:r>
       <w:r>
@@ -956,6 +955,7 @@
           <w:b w:val="0"/>
           <w:sz w:val="16"/>
         </w:rPr>
+        <w:t xml:space="preserve">        return *this;</w:t>
         <w:br/>
       </w:r>
       <w:r>
@@ -964,7 +964,7 @@
           <w:b w:val="0"/>
           <w:sz w:val="16"/>
         </w:rPr>
-        <w:t xml:space="preserve">    AtomT* data() { return data_; }</w:t>
+        <w:t xml:space="preserve">    }</w:t>
         <w:br/>
       </w:r>
       <w:r>
@@ -973,7 +973,6 @@
           <w:b w:val="0"/>
           <w:sz w:val="16"/>
         </w:rPr>
-        <w:t xml:space="preserve">    const AtomT* data() const { return data_; }</w:t>
         <w:br/>
       </w:r>
       <w:r>
@@ -982,7 +981,7 @@
           <w:b w:val="0"/>
           <w:sz w:val="16"/>
         </w:rPr>
-        <w:t xml:space="preserve">    std::size_t size() const { return size_; }</w:t>
+        <w:t xml:space="preserve">    AtomT* data() { return data_; }</w:t>
         <w:br/>
       </w:r>
       <w:r>
@@ -991,6 +990,7 @@
           <w:b w:val="0"/>
           <w:sz w:val="16"/>
         </w:rPr>
+        <w:t xml:space="preserve">    const AtomT* data() const { return data_; }</w:t>
         <w:br/>
       </w:r>
       <w:r>
@@ -999,7 +999,7 @@
           <w:b w:val="0"/>
           <w:sz w:val="16"/>
         </w:rPr>
-        <w:t xml:space="preserve">    void copy_to_host(AtomT* host_ptr) const {</w:t>
+        <w:t xml:space="preserve">    size_t size() const { return size_; }</w:t>
         <w:br/>
       </w:r>
       <w:r>
@@ -1008,7 +1008,6 @@
           <w:b w:val="0"/>
           <w:sz w:val="16"/>
         </w:rPr>
-        <w:t xml:space="preserve">        if (size_ &gt; 0) {</w:t>
         <w:br/>
       </w:r>
       <w:r>
@@ -1017,7 +1016,7 @@
           <w:b w:val="0"/>
           <w:sz w:val="16"/>
         </w:rPr>
-        <w:t xml:space="preserve">            cudaError_t err = cudaMemcpy(host_ptr, data_, size_ * sizeof(AtomT), cudaMemcpyDeviceToHost);</w:t>
+        <w:t xml:space="preserve">    void copy_to_host(AtomT* host_ptr) const {</w:t>
         <w:br/>
       </w:r>
       <w:r>
@@ -1026,7 +1025,7 @@
           <w:b w:val="0"/>
           <w:sz w:val="16"/>
         </w:rPr>
-        <w:t xml:space="preserve">            if (err != cudaSuccess) {</w:t>
+        <w:t xml:space="preserve">        if (size_ &gt; 0) {</w:t>
         <w:br/>
       </w:r>
       <w:r>
@@ -1035,7 +1034,7 @@
           <w:b w:val="0"/>
           <w:sz w:val="16"/>
         </w:rPr>
-        <w:t xml:space="preserve">                throw std::runtime_error(cudaGetErrorString(err));</w:t>
+        <w:t xml:space="preserve">            cudaError_t err = cudaMemcpy(host_ptr, data_, size_ * sizeof(AtomT), cudaMemcpyDeviceToHost);</w:t>
         <w:br/>
       </w:r>
       <w:r>
@@ -1044,7 +1043,7 @@
           <w:b w:val="0"/>
           <w:sz w:val="16"/>
         </w:rPr>
-        <w:t xml:space="preserve">            }</w:t>
+        <w:t xml:space="preserve">            if (err != cudaSuccess) {</w:t>
         <w:br/>
       </w:r>
       <w:r>
@@ -1053,7 +1052,7 @@
           <w:b w:val="0"/>
           <w:sz w:val="16"/>
         </w:rPr>
-        <w:t xml:space="preserve">        }</w:t>
+        <w:t xml:space="preserve">                throw runtime_error(cudaGetErrorString(err));</w:t>
         <w:br/>
       </w:r>
       <w:r>
@@ -1062,7 +1061,7 @@
           <w:b w:val="0"/>
           <w:sz w:val="16"/>
         </w:rPr>
-        <w:t xml:space="preserve">    }</w:t>
+        <w:t xml:space="preserve">            }</w:t>
         <w:br/>
       </w:r>
       <w:r>
@@ -1071,6 +1070,7 @@
           <w:b w:val="0"/>
           <w:sz w:val="16"/>
         </w:rPr>
+        <w:t xml:space="preserve">        }</w:t>
         <w:br/>
       </w:r>
       <w:r>
@@ -1079,7 +1079,7 @@
           <w:b w:val="0"/>
           <w:sz w:val="16"/>
         </w:rPr>
-        <w:t xml:space="preserve">    void copy_from_host(const AtomT* host_ptr) {</w:t>
+        <w:t xml:space="preserve">    }</w:t>
         <w:br/>
       </w:r>
       <w:r>
@@ -1088,7 +1088,6 @@
           <w:b w:val="0"/>
           <w:sz w:val="16"/>
         </w:rPr>
-        <w:t xml:space="preserve">        if (size_ &gt; 0) {</w:t>
         <w:br/>
       </w:r>
       <w:r>
@@ -1097,7 +1096,7 @@
           <w:b w:val="0"/>
           <w:sz w:val="16"/>
         </w:rPr>
-        <w:t xml:space="preserve">            cudaError_t err = cudaMemcpy(data_, host_ptr, size_ * sizeof(AtomT), cudaMemcpyHostToDevice);</w:t>
+        <w:t xml:space="preserve">    void copy_from_host(const AtomT* host_ptr) {</w:t>
         <w:br/>
       </w:r>
       <w:r>
@@ -1106,7 +1105,7 @@
           <w:b w:val="0"/>
           <w:sz w:val="16"/>
         </w:rPr>
-        <w:t xml:space="preserve">            if (err != cudaSuccess) {</w:t>
+        <w:t xml:space="preserve">        if (size_ &gt; 0) {</w:t>
         <w:br/>
       </w:r>
       <w:r>
@@ -1115,7 +1114,25 @@
           <w:b w:val="0"/>
           <w:sz w:val="16"/>
         </w:rPr>
-        <w:t xml:space="preserve">                throw std::runtime_error(cudaGetErrorString(err));</w:t>
+        <w:t xml:space="preserve">            cudaError_t err = cudaMemcpy(data_, host_ptr, size_ * sizeof(AtomT), cudaMemcpyHostToDevice);</w:t>
+        <w:br/>
+      </w:r>
+      <w:r>
+        <w:rPr>
+          <w:rFonts w:ascii="Courier New" w:hAnsi="Courier New" w:eastAsia="Courier New"/>
+          <w:b w:val="0"/>
+          <w:sz w:val="16"/>
+        </w:rPr>
+        <w:t xml:space="preserve">            if (err != cudaSuccess) {</w:t>
+        <w:br/>
+      </w:r>
+      <w:r>
+        <w:rPr>
+          <w:rFonts w:ascii="Courier New" w:hAnsi="Courier New" w:eastAsia="Courier New"/>
+          <w:b w:val="0"/>
+          <w:sz w:val="16"/>
+        </w:rPr>
+        <w:t xml:space="preserve">                throw runtime_error(cudaGetErrorString(err));</w:t>
         <w:br/>
       </w:r>
       <w:r>
@@ -1296,7 +1313,7 @@
           <w:b w:val="0"/>
           <w:sz w:val="16"/>
         </w:rPr>
-        <w:t>template &lt;typename AtomT&gt;</w:t>
+        <w:t>using namespace std;</w:t>
         <w:br/>
       </w:r>
       <w:r>
@@ -1305,7 +1322,6 @@
           <w:b w:val="0"/>
           <w:sz w:val="16"/>
         </w:rPr>
-        <w:t>class VectorView {</w:t>
         <w:br/>
       </w:r>
       <w:r>
@@ -1314,7 +1330,7 @@
           <w:b w:val="0"/>
           <w:sz w:val="16"/>
         </w:rPr>
-        <w:t>private:</w:t>
+        <w:t>template &lt;typename AtomT&gt;</w:t>
         <w:br/>
       </w:r>
       <w:r>
@@ -1323,7 +1339,7 @@
           <w:b w:val="0"/>
           <w:sz w:val="16"/>
         </w:rPr>
-        <w:t xml:space="preserve">    AtomT* data_;</w:t>
+        <w:t>class VectorView {</w:t>
         <w:br/>
       </w:r>
       <w:r>
@@ -1332,7 +1348,7 @@
           <w:b w:val="0"/>
           <w:sz w:val="16"/>
         </w:rPr>
-        <w:t xml:space="preserve">    std::size_t size_;</w:t>
+        <w:t>private:</w:t>
         <w:br/>
       </w:r>
       <w:r>
@@ -1341,6 +1357,7 @@
           <w:b w:val="0"/>
           <w:sz w:val="16"/>
         </w:rPr>
+        <w:t xml:space="preserve">    AtomT* data_;</w:t>
         <w:br/>
       </w:r>
       <w:r>
@@ -1349,7 +1366,7 @@
           <w:b w:val="0"/>
           <w:sz w:val="16"/>
         </w:rPr>
-        <w:t>public:</w:t>
+        <w:t xml:space="preserve">    size_t size_;</w:t>
         <w:br/>
       </w:r>
       <w:r>
@@ -1358,7 +1375,6 @@
           <w:b w:val="0"/>
           <w:sz w:val="16"/>
         </w:rPr>
-        <w:t xml:space="preserve">    __host__ __device__ VectorView(AtomT* data, std::size_t size) : data_(data), size_(size) {}</w:t>
         <w:br/>
       </w:r>
       <w:r>
@@ -1367,7 +1383,7 @@
           <w:b w:val="0"/>
           <w:sz w:val="16"/>
         </w:rPr>
-        <w:t xml:space="preserve">    __host__ __device__ VectorView() : data_(nullptr), size_(0) {} // For convenience</w:t>
+        <w:t>public:</w:t>
         <w:br/>
       </w:r>
       <w:r>
@@ -1376,6 +1392,7 @@
           <w:b w:val="0"/>
           <w:sz w:val="16"/>
         </w:rPr>
+        <w:t xml:space="preserve">    __host__ __device__ VectorView(AtomT* data, size_t size) : data_(data), size_(size) {}</w:t>
         <w:br/>
       </w:r>
       <w:r>
@@ -1384,7 +1401,7 @@
           <w:b w:val="0"/>
           <w:sz w:val="16"/>
         </w:rPr>
-        <w:t xml:space="preserve">    __host__ __device__ std::size_t size() const {</w:t>
+        <w:t xml:space="preserve">    __host__ __device__ VectorView() : data_(nullptr), size_(0) {}</w:t>
         <w:br/>
       </w:r>
       <w:r>
@@ -1393,7 +1410,6 @@
           <w:b w:val="0"/>
           <w:sz w:val="16"/>
         </w:rPr>
-        <w:t xml:space="preserve">        return size_;</w:t>
         <w:br/>
       </w:r>
       <w:r>
@@ -1402,7 +1418,7 @@
           <w:b w:val="0"/>
           <w:sz w:val="16"/>
         </w:rPr>
-        <w:t xml:space="preserve">    }</w:t>
+        <w:t xml:space="preserve">    __host__ __device__ size_t size() const {</w:t>
         <w:br/>
       </w:r>
       <w:r>
@@ -1411,6 +1427,7 @@
           <w:b w:val="0"/>
           <w:sz w:val="16"/>
         </w:rPr>
+        <w:t xml:space="preserve">        return size_;</w:t>
         <w:br/>
       </w:r>
       <w:r>
@@ -1419,7 +1436,7 @@
           <w:b w:val="0"/>
           <w:sz w:val="16"/>
         </w:rPr>
-        <w:t xml:space="preserve">    __host__ __device__ AtomT&amp; operator[](std::size_t n) {</w:t>
+        <w:t xml:space="preserve">    }</w:t>
         <w:br/>
       </w:r>
       <w:r>
@@ -1428,7 +1445,6 @@
           <w:b w:val="0"/>
           <w:sz w:val="16"/>
         </w:rPr>
-        <w:t xml:space="preserve">        return data_[n];</w:t>
         <w:br/>
       </w:r>
       <w:r>
@@ -1437,7 +1453,7 @@
           <w:b w:val="0"/>
           <w:sz w:val="16"/>
         </w:rPr>
-        <w:t xml:space="preserve">    }</w:t>
+        <w:t xml:space="preserve">    __host__ __device__ AtomT&amp; operator[](size_t n) {</w:t>
         <w:br/>
       </w:r>
       <w:r>
@@ -1446,6 +1462,7 @@
           <w:b w:val="0"/>
           <w:sz w:val="16"/>
         </w:rPr>
+        <w:t xml:space="preserve">        return data_[n];</w:t>
         <w:br/>
       </w:r>
       <w:r>
@@ -1454,7 +1471,7 @@
           <w:b w:val="0"/>
           <w:sz w:val="16"/>
         </w:rPr>
-        <w:t xml:space="preserve">    __host__ __device__ const AtomT&amp; operator[](std::size_t n) const {</w:t>
+        <w:t xml:space="preserve">    }</w:t>
         <w:br/>
       </w:r>
       <w:r>
@@ -1463,7 +1480,6 @@
           <w:b w:val="0"/>
           <w:sz w:val="16"/>
         </w:rPr>
-        <w:t xml:space="preserve">        return data_[n];</w:t>
         <w:br/>
       </w:r>
       <w:r>
@@ -1472,7 +1488,7 @@
           <w:b w:val="0"/>
           <w:sz w:val="16"/>
         </w:rPr>
-        <w:t xml:space="preserve">    }</w:t>
+        <w:t xml:space="preserve">    __host__ __device__ const AtomT&amp; operator[](size_t n) const {</w:t>
         <w:br/>
       </w:r>
       <w:r>
@@ -1481,6 +1497,7 @@
           <w:b w:val="0"/>
           <w:sz w:val="16"/>
         </w:rPr>
+        <w:t xml:space="preserve">        return data_[n];</w:t>
         <w:br/>
       </w:r>
       <w:r>
@@ -1489,7 +1506,7 @@
           <w:b w:val="0"/>
           <w:sz w:val="16"/>
         </w:rPr>
-        <w:t xml:space="preserve">    __host__ __device__ AtomT&amp; operator()(std::size_t i) {</w:t>
+        <w:t xml:space="preserve">    }</w:t>
         <w:br/>
       </w:r>
       <w:r>
@@ -1498,7 +1515,6 @@
           <w:b w:val="0"/>
           <w:sz w:val="16"/>
         </w:rPr>
-        <w:t xml:space="preserve">        return data_[i];</w:t>
         <w:br/>
       </w:r>
       <w:r>
@@ -1507,7 +1523,7 @@
           <w:b w:val="0"/>
           <w:sz w:val="16"/>
         </w:rPr>
-        <w:t xml:space="preserve">    }</w:t>
+        <w:t xml:space="preserve">    __host__ __device__ AtomT&amp; operator()(size_t i) {</w:t>
         <w:br/>
       </w:r>
       <w:r>
@@ -1516,6 +1532,7 @@
           <w:b w:val="0"/>
           <w:sz w:val="16"/>
         </w:rPr>
+        <w:t xml:space="preserve">        return data_[i];</w:t>
         <w:br/>
       </w:r>
       <w:r>
@@ -1524,7 +1541,24 @@
           <w:b w:val="0"/>
           <w:sz w:val="16"/>
         </w:rPr>
-        <w:t xml:space="preserve">    __host__ __device__ const AtomT&amp; operator()(std::size_t i) const {</w:t>
+        <w:t xml:space="preserve">    }</w:t>
+        <w:br/>
+      </w:r>
+      <w:r>
+        <w:rPr>
+          <w:rFonts w:ascii="Courier New" w:hAnsi="Courier New" w:eastAsia="Courier New"/>
+          <w:b w:val="0"/>
+          <w:sz w:val="16"/>
+        </w:rPr>
+        <w:br/>
+      </w:r>
+      <w:r>
+        <w:rPr>
+          <w:rFonts w:ascii="Courier New" w:hAnsi="Courier New" w:eastAsia="Courier New"/>
+          <w:b w:val="0"/>
+          <w:sz w:val="16"/>
+        </w:rPr>
+        <w:t xml:space="preserve">    __host__ __device__ const AtomT&amp; operator()(size_t i) const {</w:t>
         <w:br/>
       </w:r>
       <w:r>
@@ -1635,7 +1669,7 @@
           <w:b w:val="0"/>
           <w:sz w:val="16"/>
         </w:rPr>
-        <w:t>#include "Data.cuh"</w:t>
+        <w:t>#include &lt;cstddef&gt;</w:t>
         <w:br/>
       </w:r>
       <w:r>
@@ -1644,7 +1678,7 @@
           <w:b w:val="0"/>
           <w:sz w:val="16"/>
         </w:rPr>
-        <w:t>#include "VectorView.cuh"</w:t>
+        <w:t>#include &lt;memory&gt;</w:t>
         <w:br/>
       </w:r>
       <w:r>
@@ -1653,7 +1687,7 @@
           <w:b w:val="0"/>
           <w:sz w:val="16"/>
         </w:rPr>
-        <w:t>#include &lt;memory&gt;</w:t>
+        <w:t>#include &lt;stdexcept&gt;</w:t>
         <w:br/>
       </w:r>
       <w:r>
@@ -1662,7 +1696,7 @@
           <w:b w:val="0"/>
           <w:sz w:val="16"/>
         </w:rPr>
-        <w:t>#include &lt;cstddef&gt;</w:t>
+        <w:t>#include &lt;cuda_runtime.h&gt;</w:t>
         <w:br/>
       </w:r>
       <w:r>
@@ -1671,6 +1705,7 @@
           <w:b w:val="0"/>
           <w:sz w:val="16"/>
         </w:rPr>
+        <w:t>#include "Data.cuh"</w:t>
         <w:br/>
       </w:r>
       <w:r>
@@ -1679,7 +1714,7 @@
           <w:b w:val="0"/>
           <w:sz w:val="16"/>
         </w:rPr>
-        <w:t>template &lt;typename AtomT&gt;</w:t>
+        <w:t>#include "VectorView.cuh"</w:t>
         <w:br/>
       </w:r>
       <w:r>
@@ -1688,7 +1723,7 @@
           <w:b w:val="0"/>
           <w:sz w:val="16"/>
         </w:rPr>
-        <w:t>class Vector {</w:t>
+        <w:t>#include "kernel_vecadd.cuh"</w:t>
         <w:br/>
       </w:r>
       <w:r>
@@ -1697,7 +1732,6 @@
           <w:b w:val="0"/>
           <w:sz w:val="16"/>
         </w:rPr>
-        <w:t>private:</w:t>
         <w:br/>
       </w:r>
       <w:r>
@@ -1706,7 +1740,7 @@
           <w:b w:val="0"/>
           <w:sz w:val="16"/>
         </w:rPr>
-        <w:t xml:space="preserve">    std::shared_ptr&lt;Data&lt;AtomT&gt;&gt; data_;</w:t>
+        <w:t>using namespace std;</w:t>
         <w:br/>
       </w:r>
       <w:r>
@@ -1715,7 +1749,6 @@
           <w:b w:val="0"/>
           <w:sz w:val="16"/>
         </w:rPr>
-        <w:t xml:space="preserve">    VectorView&lt;AtomT&gt; view_;</w:t>
         <w:br/>
       </w:r>
       <w:r>
@@ -1724,6 +1757,7 @@
           <w:b w:val="0"/>
           <w:sz w:val="16"/>
         </w:rPr>
+        <w:t>template &lt;typename AtomT&gt;</w:t>
         <w:br/>
       </w:r>
       <w:r>
@@ -1732,7 +1766,7 @@
           <w:b w:val="0"/>
           <w:sz w:val="16"/>
         </w:rPr>
-        <w:t>public:</w:t>
+        <w:t>class Vector {</w:t>
         <w:br/>
       </w:r>
       <w:r>
@@ -1741,7 +1775,7 @@
           <w:b w:val="0"/>
           <w:sz w:val="16"/>
         </w:rPr>
-        <w:t xml:space="preserve">    explicit Vector(std::size_t size) </w:t>
+        <w:t>private:</w:t>
         <w:br/>
       </w:r>
       <w:r>
@@ -1750,7 +1784,7 @@
           <w:b w:val="0"/>
           <w:sz w:val="16"/>
         </w:rPr>
-        <w:t xml:space="preserve">        : data_(std::make_shared&lt;Data&lt;AtomT&gt;&gt;(size)),</w:t>
+        <w:t xml:space="preserve">    shared_ptr&lt;Data&lt;AtomT&gt;&gt; data_;</w:t>
         <w:br/>
       </w:r>
       <w:r>
@@ -1759,7 +1793,7 @@
           <w:b w:val="0"/>
           <w:sz w:val="16"/>
         </w:rPr>
-        <w:t xml:space="preserve">          view_(data_-&gt;data(), size) {}</w:t>
+        <w:t xml:space="preserve">    VectorView&lt;AtomT&gt; view_;</w:t>
         <w:br/>
       </w:r>
       <w:r>
@@ -1776,7 +1810,7 @@
           <w:b w:val="0"/>
           <w:sz w:val="16"/>
         </w:rPr>
-        <w:t xml:space="preserve">    // Optionally allow creating from existing Data to support views of subsets,</w:t>
+        <w:t>public:</w:t>
         <w:br/>
       </w:r>
       <w:r>
@@ -1785,7 +1819,7 @@
           <w:b w:val="0"/>
           <w:sz w:val="16"/>
         </w:rPr>
-        <w:t xml:space="preserve">    // but assignment just says Vector(size).</w:t>
+        <w:t xml:space="preserve">    explicit Vector(size_t size) </w:t>
         <w:br/>
       </w:r>
       <w:r>
@@ -1794,7 +1828,7 @@
           <w:b w:val="0"/>
           <w:sz w:val="16"/>
         </w:rPr>
-        <w:t xml:space="preserve">    // Let's stick to the diagram.</w:t>
+        <w:t xml:space="preserve">        : data_(make_shared&lt;Data&lt;AtomT&gt;&gt;(size)),</w:t>
         <w:br/>
       </w:r>
       <w:r>
@@ -1803,6 +1837,7 @@
           <w:b w:val="0"/>
           <w:sz w:val="16"/>
         </w:rPr>
+        <w:t xml:space="preserve">          view_(data_-&gt;data(), size) {}</w:t>
         <w:br/>
       </w:r>
       <w:r>
@@ -1811,7 +1846,6 @@
           <w:b w:val="0"/>
           <w:sz w:val="16"/>
         </w:rPr>
-        <w:t xml:space="preserve">    std::size_t size() const {</w:t>
         <w:br/>
       </w:r>
       <w:r>
@@ -1820,7 +1854,7 @@
           <w:b w:val="0"/>
           <w:sz w:val="16"/>
         </w:rPr>
-        <w:t xml:space="preserve">        return view_.size();</w:t>
+        <w:t xml:space="preserve">    size_t size() const {</w:t>
         <w:br/>
       </w:r>
       <w:r>
@@ -1829,7 +1863,7 @@
           <w:b w:val="0"/>
           <w:sz w:val="16"/>
         </w:rPr>
-        <w:t xml:space="preserve">    }</w:t>
+        <w:t xml:space="preserve">        return view_.size();</w:t>
         <w:br/>
       </w:r>
       <w:r>
@@ -1838,6 +1872,7 @@
           <w:b w:val="0"/>
           <w:sz w:val="16"/>
         </w:rPr>
+        <w:t xml:space="preserve">    }</w:t>
         <w:br/>
       </w:r>
       <w:r>
@@ -1846,7 +1881,6 @@
           <w:b w:val="0"/>
           <w:sz w:val="16"/>
         </w:rPr>
-        <w:t xml:space="preserve">    Data&lt;AtomT&gt;&amp; data() {</w:t>
         <w:br/>
       </w:r>
       <w:r>
@@ -1855,7 +1889,7 @@
           <w:b w:val="0"/>
           <w:sz w:val="16"/>
         </w:rPr>
-        <w:t xml:space="preserve">        return *data_;</w:t>
+        <w:t xml:space="preserve">    Data&lt;AtomT&gt;&amp; data() {</w:t>
         <w:br/>
       </w:r>
       <w:r>
@@ -1864,7 +1898,7 @@
           <w:b w:val="0"/>
           <w:sz w:val="16"/>
         </w:rPr>
-        <w:t xml:space="preserve">    }</w:t>
+        <w:t xml:space="preserve">        return *data_;</w:t>
         <w:br/>
       </w:r>
       <w:r>
@@ -1873,6 +1907,7 @@
           <w:b w:val="0"/>
           <w:sz w:val="16"/>
         </w:rPr>
+        <w:t xml:space="preserve">    }</w:t>
         <w:br/>
       </w:r>
       <w:r>
@@ -1881,7 +1916,6 @@
           <w:b w:val="0"/>
           <w:sz w:val="16"/>
         </w:rPr>
-        <w:t xml:space="preserve">    const Data&lt;AtomT&gt;&amp; data() const {</w:t>
         <w:br/>
       </w:r>
       <w:r>
@@ -1890,7 +1924,7 @@
           <w:b w:val="0"/>
           <w:sz w:val="16"/>
         </w:rPr>
-        <w:t xml:space="preserve">        return *data_;</w:t>
+        <w:t xml:space="preserve">    const Data&lt;AtomT&gt;&amp; data() const {</w:t>
         <w:br/>
       </w:r>
       <w:r>
@@ -1899,7 +1933,7 @@
           <w:b w:val="0"/>
           <w:sz w:val="16"/>
         </w:rPr>
-        <w:t xml:space="preserve">    }</w:t>
+        <w:t xml:space="preserve">        return *data_;</w:t>
         <w:br/>
       </w:r>
       <w:r>
@@ -1908,6 +1942,7 @@
           <w:b w:val="0"/>
           <w:sz w:val="16"/>
         </w:rPr>
+        <w:t xml:space="preserve">    }</w:t>
         <w:br/>
       </w:r>
       <w:r>
@@ -1916,7 +1951,6 @@
           <w:b w:val="0"/>
           <w:sz w:val="16"/>
         </w:rPr>
-        <w:t xml:space="preserve">    VectorView&lt;AtomT&gt;&amp; view() {</w:t>
         <w:br/>
       </w:r>
       <w:r>
@@ -1925,7 +1959,7 @@
           <w:b w:val="0"/>
           <w:sz w:val="16"/>
         </w:rPr>
-        <w:t xml:space="preserve">        return view_;</w:t>
+        <w:t xml:space="preserve">    VectorView&lt;AtomT&gt;&amp; view() {</w:t>
         <w:br/>
       </w:r>
       <w:r>
@@ -1934,7 +1968,7 @@
           <w:b w:val="0"/>
           <w:sz w:val="16"/>
         </w:rPr>
-        <w:t xml:space="preserve">    }</w:t>
+        <w:t xml:space="preserve">        return view_;</w:t>
         <w:br/>
       </w:r>
       <w:r>
@@ -1943,6 +1977,7 @@
           <w:b w:val="0"/>
           <w:sz w:val="16"/>
         </w:rPr>
+        <w:t xml:space="preserve">    }</w:t>
         <w:br/>
       </w:r>
       <w:r>
@@ -1951,7 +1986,6 @@
           <w:b w:val="0"/>
           <w:sz w:val="16"/>
         </w:rPr>
-        <w:t xml:space="preserve">    const VectorView&lt;AtomT&gt;&amp; view() const {</w:t>
         <w:br/>
       </w:r>
       <w:r>
@@ -1960,7 +1994,7 @@
           <w:b w:val="0"/>
           <w:sz w:val="16"/>
         </w:rPr>
-        <w:t xml:space="preserve">        return view_;</w:t>
+        <w:t xml:space="preserve">    const VectorView&lt;AtomT&gt;&amp; view() const {</w:t>
         <w:br/>
       </w:r>
       <w:r>
@@ -1969,7 +2003,7 @@
           <w:b w:val="0"/>
           <w:sz w:val="16"/>
         </w:rPr>
-        <w:t xml:space="preserve">    }</w:t>
+        <w:t xml:space="preserve">        return view_;</w:t>
         <w:br/>
       </w:r>
       <w:r>
@@ -1978,6 +2012,7 @@
           <w:b w:val="0"/>
           <w:sz w:val="16"/>
         </w:rPr>
+        <w:t xml:space="preserve">    }</w:t>
         <w:br/>
       </w:r>
       <w:r>
@@ -1986,7 +2021,6 @@
           <w:b w:val="0"/>
           <w:sz w:val="16"/>
         </w:rPr>
-        <w:t xml:space="preserve">    void add_from(const Vector&amp; lhs, const Vector&amp; rhs);</w:t>
         <w:br/>
       </w:r>
       <w:r>
@@ -1995,7 +2029,7 @@
           <w:b w:val="0"/>
           <w:sz w:val="16"/>
         </w:rPr>
-        <w:t>};</w:t>
+        <w:t xml:space="preserve">    void add_from(const Vector&amp; lhs, const Vector&amp; rhs);</w:t>
         <w:br/>
       </w:r>
       <w:r>
@@ -2004,6 +2038,7 @@
           <w:b w:val="0"/>
           <w:sz w:val="16"/>
         </w:rPr>
+        <w:t>};</w:t>
         <w:br/>
       </w:r>
       <w:r>
@@ -2012,7 +2047,6 @@
           <w:b w:val="0"/>
           <w:sz w:val="16"/>
         </w:rPr>
-        <w:t>// operator+ declaration</w:t>
         <w:br/>
       </w:r>
       <w:r>
@@ -2047,7 +2081,7 @@
           <w:b w:val="0"/>
           <w:sz w:val="16"/>
         </w:rPr>
-        <w:t>// Include kernel to define operator+</w:t>
+        <w:t>template &lt;typename AtomT&gt;</w:t>
         <w:br/>
       </w:r>
       <w:r>
@@ -2056,7 +2090,7 @@
           <w:b w:val="0"/>
           <w:sz w:val="16"/>
         </w:rPr>
-        <w:t>#include "kernel_vecadd.cuh"</w:t>
+        <w:t>void Vector&lt;AtomT&gt;::add_from(const Vector&amp; lhs, const Vector&amp; rhs) {</w:t>
         <w:br/>
       </w:r>
       <w:r>
@@ -2065,7 +2099,7 @@
           <w:b w:val="0"/>
           <w:sz w:val="16"/>
         </w:rPr>
-        <w:t>#include &lt;stdexcept&gt;</w:t>
+        <w:t xml:space="preserve">    if (lhs.size() != rhs.size() || size() != lhs.size()) {</w:t>
         <w:br/>
       </w:r>
       <w:r>
@@ -2074,6 +2108,7 @@
           <w:b w:val="0"/>
           <w:sz w:val="16"/>
         </w:rPr>
+        <w:t xml:space="preserve">        throw invalid_argument("Vectors must have the same size");</w:t>
         <w:br/>
       </w:r>
       <w:r>
@@ -2082,7 +2117,7 @@
           <w:b w:val="0"/>
           <w:sz w:val="16"/>
         </w:rPr>
-        <w:t>template &lt;typename AtomT&gt;</w:t>
+        <w:t xml:space="preserve">    }</w:t>
         <w:br/>
       </w:r>
       <w:r>
@@ -2091,7 +2126,6 @@
           <w:b w:val="0"/>
           <w:sz w:val="16"/>
         </w:rPr>
-        <w:t>void Vector&lt;AtomT&gt;::add_from(const Vector&amp; lhs, const Vector&amp; rhs) {</w:t>
         <w:br/>
       </w:r>
       <w:r>
@@ -2100,7 +2134,7 @@
           <w:b w:val="0"/>
           <w:sz w:val="16"/>
         </w:rPr>
-        <w:t xml:space="preserve">    if (lhs.size() != rhs.size() || size() != lhs.size()) {</w:t>
+        <w:t xml:space="preserve">    size_t blockSize = 256;</w:t>
         <w:br/>
       </w:r>
       <w:r>
@@ -2109,7 +2143,7 @@
           <w:b w:val="0"/>
           <w:sz w:val="16"/>
         </w:rPr>
-        <w:t xml:space="preserve">        throw std::invalid_argument("Vectors must have the same size");</w:t>
+        <w:t xml:space="preserve">    size_t numBlocks = (lhs.size() + blockSize - 1) / blockSize;</w:t>
         <w:br/>
       </w:r>
       <w:r>
@@ -2118,7 +2152,6 @@
           <w:b w:val="0"/>
           <w:sz w:val="16"/>
         </w:rPr>
-        <w:t xml:space="preserve">    }</w:t>
         <w:br/>
       </w:r>
       <w:r>
@@ -2127,6 +2160,7 @@
           <w:b w:val="0"/>
           <w:sz w:val="16"/>
         </w:rPr>
+        <w:t xml:space="preserve">    if (lhs.size() &gt; 0) {</w:t>
         <w:br/>
       </w:r>
       <w:r>
@@ -2135,7 +2169,7 @@
           <w:b w:val="0"/>
           <w:sz w:val="16"/>
         </w:rPr>
-        <w:t xml:space="preserve">    int blockSize = 256;</w:t>
+        <w:t xml:space="preserve">        kernel_vecadd&lt;&lt;&lt;static_cast&lt;unsigned int&gt;(numBlocks), static_cast&lt;unsigned int&gt;(blockSize)&gt;&gt;&gt;(lhs.view(), rhs.view(), view_);</w:t>
         <w:br/>
       </w:r>
       <w:r>
@@ -2144,7 +2178,7 @@
           <w:b w:val="0"/>
           <w:sz w:val="16"/>
         </w:rPr>
-        <w:t xml:space="preserve">    int numBlocks = (lhs.size() + blockSize - 1) / blockSize;</w:t>
+        <w:t xml:space="preserve">        cudaError_t err = cudaGetLastError();</w:t>
         <w:br/>
       </w:r>
       <w:r>
@@ -2153,6 +2187,7 @@
           <w:b w:val="0"/>
           <w:sz w:val="16"/>
         </w:rPr>
+        <w:t xml:space="preserve">        if (err != cudaSuccess) {</w:t>
         <w:br/>
       </w:r>
       <w:r>
@@ -2161,7 +2196,7 @@
           <w:b w:val="0"/>
           <w:sz w:val="16"/>
         </w:rPr>
-        <w:t xml:space="preserve">    if (lhs.size() &gt; 0) {</w:t>
+        <w:t xml:space="preserve">            throw runtime_error(cudaGetErrorString(err));</w:t>
         <w:br/>
       </w:r>
       <w:r>
@@ -2170,7 +2205,7 @@
           <w:b w:val="0"/>
           <w:sz w:val="16"/>
         </w:rPr>
-        <w:t xml:space="preserve">        kernel_vecadd&lt;&lt;&lt;numBlocks, blockSize&gt;&gt;&gt;(lhs.view(), rhs.view(), view_);</w:t>
+        <w:t xml:space="preserve">        }</w:t>
         <w:br/>
       </w:r>
       <w:r>
@@ -2179,7 +2214,7 @@
           <w:b w:val="0"/>
           <w:sz w:val="16"/>
         </w:rPr>
-        <w:t xml:space="preserve">        cudaError_t err = cudaGetLastError();</w:t>
+        <w:t xml:space="preserve">        err = cudaDeviceSynchronize();</w:t>
         <w:br/>
       </w:r>
       <w:r>
@@ -2197,43 +2232,7 @@
           <w:b w:val="0"/>
           <w:sz w:val="16"/>
         </w:rPr>
-        <w:t xml:space="preserve">            throw std::runtime_error(cudaGetErrorString(err));</w:t>
-        <w:br/>
-      </w:r>
-      <w:r>
-        <w:rPr>
-          <w:rFonts w:ascii="Courier New" w:hAnsi="Courier New" w:eastAsia="Courier New"/>
-          <w:b w:val="0"/>
-          <w:sz w:val="16"/>
-        </w:rPr>
-        <w:t xml:space="preserve">        }</w:t>
-        <w:br/>
-      </w:r>
-      <w:r>
-        <w:rPr>
-          <w:rFonts w:ascii="Courier New" w:hAnsi="Courier New" w:eastAsia="Courier New"/>
-          <w:b w:val="0"/>
-          <w:sz w:val="16"/>
-        </w:rPr>
-        <w:t xml:space="preserve">        err = cudaDeviceSynchronize();</w:t>
-        <w:br/>
-      </w:r>
-      <w:r>
-        <w:rPr>
-          <w:rFonts w:ascii="Courier New" w:hAnsi="Courier New" w:eastAsia="Courier New"/>
-          <w:b w:val="0"/>
-          <w:sz w:val="16"/>
-        </w:rPr>
-        <w:t xml:space="preserve">        if (err != cudaSuccess) {</w:t>
-        <w:br/>
-      </w:r>
-      <w:r>
-        <w:rPr>
-          <w:rFonts w:ascii="Courier New" w:hAnsi="Courier New" w:eastAsia="Courier New"/>
-          <w:b w:val="0"/>
-          <w:sz w:val="16"/>
-        </w:rPr>
-        <w:t xml:space="preserve">            throw std::runtime_error(cudaGetErrorString(err));</w:t>
+        <w:t xml:space="preserve">            throw runtime_error(cudaGetErrorString(err));</w:t>
         <w:br/>
       </w:r>
       <w:r>
@@ -2406,7 +2405,7 @@
           <w:b w:val="0"/>
           <w:sz w:val="16"/>
         </w:rPr>
-        <w:t>#include "VectorView.cuh"</w:t>
+        <w:t>#include &lt;cstddef&gt;</w:t>
         <w:br/>
       </w:r>
       <w:r>
@@ -2415,6 +2414,7 @@
           <w:b w:val="0"/>
           <w:sz w:val="16"/>
         </w:rPr>
+        <w:t>#include "VectorView.cuh"</w:t>
         <w:br/>
       </w:r>
       <w:r>
@@ -2423,7 +2423,6 @@
           <w:b w:val="0"/>
           <w:sz w:val="16"/>
         </w:rPr>
-        <w:t>template &lt;typename AtomT&gt;</w:t>
         <w:br/>
       </w:r>
       <w:r>
@@ -2432,7 +2431,7 @@
           <w:b w:val="0"/>
           <w:sz w:val="16"/>
         </w:rPr>
-        <w:t>__global__ void kernel_vecadd(VectorView&lt;AtomT&gt; lhs, VectorView&lt;AtomT&gt; rhs, VectorView&lt;AtomT&gt; out) {</w:t>
+        <w:t>using namespace std;</w:t>
         <w:br/>
       </w:r>
       <w:r>
@@ -2441,7 +2440,33 @@
           <w:b w:val="0"/>
           <w:sz w:val="16"/>
         </w:rPr>
-        <w:t xml:space="preserve">    int i = blockIdx.x * blockDim.x + threadIdx.x;</w:t>
+        <w:br/>
+      </w:r>
+      <w:r>
+        <w:rPr>
+          <w:rFonts w:ascii="Courier New" w:hAnsi="Courier New" w:eastAsia="Courier New"/>
+          <w:b w:val="0"/>
+          <w:sz w:val="16"/>
+        </w:rPr>
+        <w:t>template &lt;typename AtomT&gt;</w:t>
+        <w:br/>
+      </w:r>
+      <w:r>
+        <w:rPr>
+          <w:rFonts w:ascii="Courier New" w:hAnsi="Courier New" w:eastAsia="Courier New"/>
+          <w:b w:val="0"/>
+          <w:sz w:val="16"/>
+        </w:rPr>
+        <w:t>__global__ void kernel_vecadd(VectorView&lt;AtomT&gt; lhs, VectorView&lt;AtomT&gt; rhs, VectorView&lt;AtomT&gt; out) {</w:t>
+        <w:br/>
+      </w:r>
+      <w:r>
+        <w:rPr>
+          <w:rFonts w:ascii="Courier New" w:hAnsi="Courier New" w:eastAsia="Courier New"/>
+          <w:b w:val="0"/>
+          <w:sz w:val="16"/>
+        </w:rPr>
+        <w:t xml:space="preserve">    size_t i = static_cast&lt;size_t&gt;(blockIdx.x) * blockDim.x + threadIdx.x;</w:t>
         <w:br/>
       </w:r>
       <w:r>
@@ -2569,12 +2594,38 @@
         <w:jc w:val="center"/>
       </w:pPr>
       <w:r>
-        <w:rPr>
-          <w:rFonts w:ascii="Times New Roman" w:hAnsi="Times New Roman" w:eastAsia="Times New Roman"/>
-          <w:b w:val="0"/>
-          <w:sz w:val="24"/>
-        </w:rPr>
-        <w:t>[График будет добавлен после запуска бенчмарка на CUDA-машине]</w:t>
+        <w:drawing>
+          <wp:inline xmlns:a="http://schemas.openxmlformats.org/drawingml/2006/main" xmlns:pic="http://schemas.openxmlformats.org/drawingml/2006/picture">
+            <wp:extent cx="5940000" cy="4242857"/>
+            <wp:docPr id="1" name="Picture 1"/>
+            <wp:cNvGraphicFramePr>
+              <a:graphicFrameLocks noChangeAspect="1"/>
+            </wp:cNvGraphicFramePr>
+            <a:graphic>
+              <a:graphicData uri="http://schemas.openxmlformats.org/drawingml/2006/picture">
+                <pic:pic>
+                  <pic:nvPicPr>
+                    <pic:cNvPr id="0" name="real_complexity.png"/>
+                    <pic:cNvPicPr/>
+                  </pic:nvPicPr>
+                  <pic:blipFill>
+                    <a:blip r:embed="rId10"/>
+                    <a:stretch>
+                      <a:fillRect/>
+                    </a:stretch>
+                  </pic:blipFill>
+                  <pic:spPr>
+                    <a:xfrm>
+                      <a:off x="0" y="0"/>
+                      <a:ext cx="5940000" cy="4242857"/>
+                    </a:xfrm>
+                    <a:prstGeom prst="rect"/>
+                  </pic:spPr>
+                </pic:pic>
+              </a:graphicData>
+            </a:graphic>
+          </wp:inline>
+        </w:drawing>
       </w:r>
     </w:p>
     <w:p>
@@ -2610,12 +2661,38 @@
         <w:jc w:val="center"/>
       </w:pPr>
       <w:r>
-        <w:rPr>
-          <w:rFonts w:ascii="Times New Roman" w:hAnsi="Times New Roman" w:eastAsia="Times New Roman"/>
-          <w:b w:val="0"/>
-          <w:sz w:val="24"/>
-        </w:rPr>
-        <w:t>[График будет добавлен после запуска бенчмарка на CUDA-машине]</w:t>
+        <w:drawing>
+          <wp:inline xmlns:a="http://schemas.openxmlformats.org/drawingml/2006/main" xmlns:pic="http://schemas.openxmlformats.org/drawingml/2006/picture">
+            <wp:extent cx="5940000" cy="4242857"/>
+            <wp:docPr id="2" name="Picture 2"/>
+            <wp:cNvGraphicFramePr>
+              <a:graphicFrameLocks noChangeAspect="1"/>
+            </wp:cNvGraphicFramePr>
+            <a:graphic>
+              <a:graphicData uri="http://schemas.openxmlformats.org/drawingml/2006/picture">
+                <pic:pic>
+                  <pic:nvPicPr>
+                    <pic:cNvPr id="0" name="speedup.png"/>
+                    <pic:cNvPicPr/>
+                  </pic:nvPicPr>
+                  <pic:blipFill>
+                    <a:blip r:embed="rId11"/>
+                    <a:stretch>
+                      <a:fillRect/>
+                    </a:stretch>
+                  </pic:blipFill>
+                  <pic:spPr>
+                    <a:xfrm>
+                      <a:off x="0" y="0"/>
+                      <a:ext cx="5940000" cy="4242857"/>
+                    </a:xfrm>
+                    <a:prstGeom prst="rect"/>
+                  </pic:spPr>
+                </pic:pic>
+              </a:graphicData>
+            </a:graphic>
+          </wp:inline>
+        </w:drawing>
       </w:r>
     </w:p>
     <w:p>

</xml_diff>